<commit_message>
Admin kann Eintraege korrigieren und entfernen
Korrekturen ueberschreiben nichts: sie werden als eigene Datensaetze
(type: correction / type: delete) angehaengt und erst beim Lesen auf den
Originaleintrag angewendet. Damit bleibt die append-only-Zusage aus dem
Abgabedokument gueltig und jede Aenderung an einer Arbeitszeit ist
nachvollziehbar - wer sie wann gemacht hat, zeigt die Admin-Ansicht.

Nur Rolle admin darf korrigieren, CSRF-geschuetzt, Aktion und Zeitstempel
werden serverseitig validiert. Eintraege aus der Zeit vor den IDs bekommen
eine stabile Ersatz-ID, damit auch sie bearbeitbar sind.

Tests von 26 auf 47 erweitert; Dokument, README und Drehbuch nachgezogen.

Co-Authored-By: Claude Opus 5 <noreply@anthropic.com>
</commit_message>
<xml_diff>
--- a/docs/Abgabe_Zeiterfassung.docx
+++ b/docs/Abgabe_Zeiterfassung.docx
@@ -256,7 +256,7 @@
               <w:rPr>
                 <w:sz w:val="17"/>
               </w:rPr>
-              <w:t>Login mit Rollen user / admin; Admin sieht alle Mitarbeitenden (/admin)</w:t>
+              <w:t>Login mit Rollen user / admin; Admin sieht alle Mitarbeitenden und kann Eintraege korrigieren</w:t>
             </w:r>
           </w:p>
         </w:tc>
@@ -1488,7 +1488,7 @@
               <w:rPr>
                 <w:sz w:val="17"/>
               </w:rPr>
-              <w:t>Rolle admin erforderlich für /admin; user sieht ausschliesslich eigene Einträge</w:t>
+              <w:t>Rolle admin erforderlich für /admin sowie für Korrigieren und Entfernen; user sieht nur eigene Einträge und kann nichts Fremdes ändern</w:t>
             </w:r>
           </w:p>
         </w:tc>
@@ -2043,6 +2043,15 @@
       </w:r>
     </w:p>
     <w:p>
+      <w:r>
+        <w:rPr>
+          <w:b w:val="0"/>
+          <w:i w:val="0"/>
+        </w:rPr>
+        <w:t>Auch Korrekturen durch den Admin überschreiben nichts. Eine Änderung wird als eigener Datensatz (type: correction) angehängt und erst beim Lesen auf den Originaleintrag angewendet; ein Entfernen ist ein type: delete-Datensatz. Damit bleibt jede Änderung an einer Arbeitszeit nachvollziehbar – wer sie wann gemacht hat, steht im Log und wird in der Admin-Ansicht angezeigt. Bei Arbeitszeiten ist das kein Detail, sondern die Voraussetzung dafür, dass die Erfassung überhaupt belastbar ist.</w:t>
+      </w:r>
+    </w:p>
+    <w:p>
       <w:pPr>
         <w:pStyle w:val="Heading1"/>
       </w:pPr>
@@ -2424,7 +2433,7 @@
           <w:b w:val="0"/>
           <w:i w:val="0"/>
         </w:rPr>
-        <w:t>Automatisierte Tests – python3 app/test_app.py, 26 Tests, 0 Fehler: Health/Ready, Login inkl. Fehlversuch, CSRF-Ablehnung, alle vier Übergänge, unerlaubter Doppelübergang (409), unbekannte Aktion (400), JSONL-Persistenz, XSS-Escaping, Längenbegrenzung, RBAC (user → 403, admin → 200), Sicherheitsheader, /ready → 503 bei kaputtem Datenpfad bei gleichzeitig weiterhin gesundem /health.</w:t>
+        <w:t>Automatisierte Tests – python3 app/test_app.py, 47 Tests, 0 Fehler: Health/Ready, Login inkl. Fehlversuch, CSRF-Ablehnung, alle vier Übergänge, unerlaubter Doppelübergang (409), unbekannte Aktion (400), JSONL-Persistenz, XSS-Escaping, Längenbegrenzung, RBAC (user → 403, admin → 200), Sicherheitsheader, /ready → 503 bei kaputtem Datenpfad bei gleichzeitig weiterhin gesundem /health, sowie Admin-Korrekturen inklusive Nachweis, dass das Log wächst statt überschrieben zu werden.</w:t>
       </w:r>
     </w:p>
     <w:p>

</xml_diff>

<commit_message>
Admin-Ansicht: Filter und Nachtragen fuer andere Benutzer
Filter nach Datum von/bis, Benutzer, Aktion und Notiztext, einzeln und
kombiniert. Der Zaehler nennt Treffer und Gesamtzahl; der Filter bleibt
beim Bearbeiten, Loeschen und Nachtragen erhalten.

Nachtragen legt eine Stempelung fuer einen beliebigen Benutzer an - gedacht
fuer versehentlich geloeschte oder vergessene Eintraege. Der Eintrag traegt
created_by und wird in der Liste als Nachtrag ausgewiesen, damit er nicht
mit einer Selbsterfassung verwechselt wird.

Nur bekannte Filterfelder werden gelesen, Datum und Aktion serverseitig
validiert. Die Weiterleitung nach dem Speichern wird aus geprueften
Einzelwerten neu gebaut statt aus einer mitgegebenen URL - damit ist keine
offene Weiterleitung moeglich.

Tests von 47 auf 76 erweitert; Dokument, README und Drehbuch nachgezogen.

Co-Authored-By: Claude Opus 5 <noreply@anthropic.com>
</commit_message>
<xml_diff>
--- a/docs/Abgabe_Zeiterfassung.docx
+++ b/docs/Abgabe_Zeiterfassung.docx
@@ -256,7 +256,43 @@
               <w:rPr>
                 <w:sz w:val="17"/>
               </w:rPr>
-              <w:t>Login mit Rollen user / admin; Admin sieht alle Mitarbeitenden und kann Eintraege korrigieren</w:t>
+              <w:t>Login mit Rollen user / admin</w:t>
+            </w:r>
+          </w:p>
+        </w:tc>
+      </w:tr>
+      <w:tr>
+        <w:tc>
+          <w:tcPr>
+            <w:tcW w:type="dxa" w:w="1814"/>
+          </w:tcPr>
+          <w:p>
+            <w:pPr>
+              <w:spacing w:after="20"/>
+            </w:pPr>
+            <w:r/>
+            <w:r>
+              <w:rPr>
+                <w:sz w:val="17"/>
+              </w:rPr>
+              <w:t>Admin-Ansicht</w:t>
+            </w:r>
+          </w:p>
+        </w:tc>
+        <w:tc>
+          <w:tcPr>
+            <w:tcW w:type="dxa" w:w="7824"/>
+          </w:tcPr>
+          <w:p>
+            <w:pPr>
+              <w:spacing w:after="20"/>
+            </w:pPr>
+            <w:r/>
+            <w:r>
+              <w:rPr>
+                <w:sz w:val="17"/>
+              </w:rPr>
+              <w:t>Filter nach Datum, Benutzer, Aktion und Notiztext; Einträge korrigieren, entfernen und für andere nachtragen</w:t>
             </w:r>
           </w:p>
         </w:tc>
@@ -1488,7 +1524,7 @@
               <w:rPr>
                 <w:sz w:val="17"/>
               </w:rPr>
-              <w:t>Rolle admin erforderlich für /admin sowie für Korrigieren und Entfernen; user sieht nur eigene Einträge und kann nichts Fremdes ändern</w:t>
+              <w:t>Rolle admin erforderlich für /admin sowie für Korrigieren, Entfernen und Nachtragen; user sieht nur eigene Einträge und kann nichts Fremdes ändern</w:t>
             </w:r>
           </w:p>
         </w:tc>
@@ -1788,6 +1824,78 @@
               <w:rPr>
                 <w:sz w:val="17"/>
               </w:rPr>
+              <w:t>Filterwerte geprüft</w:t>
+            </w:r>
+          </w:p>
+        </w:tc>
+        <w:tc>
+          <w:tcPr>
+            <w:tcW w:type="dxa" w:w="7030"/>
+          </w:tcPr>
+          <w:p>
+            <w:pPr>
+              <w:spacing w:after="20"/>
+            </w:pPr>
+            <w:r/>
+            <w:r>
+              <w:rPr>
+                <w:sz w:val="17"/>
+              </w:rPr>
+              <w:t>Nur bekannte Filterfelder werden gelesen; Datum gegen YYYY-MM-DD und Aktion gegen die Whitelist validiert, ungültige Werte werden verworfen</w:t>
+            </w:r>
+          </w:p>
+        </w:tc>
+      </w:tr>
+      <w:tr>
+        <w:tc>
+          <w:tcPr>
+            <w:tcW w:type="dxa" w:w="2608"/>
+          </w:tcPr>
+          <w:p>
+            <w:pPr>
+              <w:spacing w:after="20"/>
+            </w:pPr>
+            <w:r/>
+            <w:r>
+              <w:rPr>
+                <w:sz w:val="17"/>
+              </w:rPr>
+              <w:t>Keine offene Weiterleitung</w:t>
+            </w:r>
+          </w:p>
+        </w:tc>
+        <w:tc>
+          <w:tcPr>
+            <w:tcW w:type="dxa" w:w="7030"/>
+          </w:tcPr>
+          <w:p>
+            <w:pPr>
+              <w:spacing w:after="20"/>
+            </w:pPr>
+            <w:r/>
+            <w:r>
+              <w:rPr>
+                <w:sz w:val="17"/>
+              </w:rPr>
+              <w:t>Das Ziel nach dem Speichern wird aus geprüften Einzelwerten neu gebaut, nie aus einer mitgegebenen URL</w:t>
+            </w:r>
+          </w:p>
+        </w:tc>
+      </w:tr>
+      <w:tr>
+        <w:tc>
+          <w:tcPr>
+            <w:tcW w:type="dxa" w:w="2608"/>
+          </w:tcPr>
+          <w:p>
+            <w:pPr>
+              <w:spacing w:after="20"/>
+            </w:pPr>
+            <w:r/>
+            <w:r>
+              <w:rPr>
+                <w:sz w:val="17"/>
+              </w:rPr>
               <w:t>Sicherheitsheader</w:t>
             </w:r>
           </w:p>
@@ -2049,6 +2157,15 @@
           <w:i w:val="0"/>
         </w:rPr>
         <w:t>Auch Korrekturen durch den Admin überschreiben nichts. Eine Änderung wird als eigener Datensatz (type: correction) angehängt und erst beim Lesen auf den Originaleintrag angewendet; ein Entfernen ist ein type: delete-Datensatz. Damit bleibt jede Änderung an einer Arbeitszeit nachvollziehbar – wer sie wann gemacht hat, steht im Log und wird in der Admin-Ansicht angezeigt. Bei Arbeitszeiten ist das kein Detail, sondern die Voraussetzung dafür, dass die Erfassung überhaupt belastbar ist.</w:t>
+      </w:r>
+    </w:p>
+    <w:p>
+      <w:r>
+        <w:rPr>
+          <w:b w:val="0"/>
+          <w:i w:val="0"/>
+        </w:rPr>
+        <w:t>Ein vom Admin nachgetragener Eintrag trägt zusätzlich created_by und wird in der Liste als Nachtrag ausgewiesen. So bleibt unterscheidbar, was der Mitarbeitende selbst gestempelt hat und was jemand für ihn eingetragen hat – etwa nach einer versehentlichen Löschung.</w:t>
       </w:r>
     </w:p>
     <w:p>
@@ -2433,7 +2550,7 @@
           <w:b w:val="0"/>
           <w:i w:val="0"/>
         </w:rPr>
-        <w:t>Automatisierte Tests – python3 app/test_app.py, 47 Tests, 0 Fehler: Health/Ready, Login inkl. Fehlversuch, CSRF-Ablehnung, alle vier Übergänge, unerlaubter Doppelübergang (409), unbekannte Aktion (400), JSONL-Persistenz, XSS-Escaping, Längenbegrenzung, RBAC (user → 403, admin → 200), Sicherheitsheader, /ready → 503 bei kaputtem Datenpfad bei gleichzeitig weiterhin gesundem /health, sowie Admin-Korrekturen inklusive Nachweis, dass das Log wächst statt überschrieben zu werden.</w:t>
+        <w:t>Automatisierte Tests – python3 app/test_app.py, 76 Tests, 0 Fehler: Health/Ready, Login inkl. Fehlversuch, CSRF-Ablehnung, alle vier Übergänge, unerlaubter Doppelübergang (409), unbekannte Aktion (400), JSONL-Persistenz, XSS-Escaping, Längenbegrenzung, RBAC (user → 403, admin → 200), Sicherheitsheader, /ready → 503 bei kaputtem Datenpfad bei gleichzeitig weiterhin gesundem /health, Admin-Korrekturen inklusive Nachweis, dass das Log wächst statt überschrieben zu werden, Nachträge mit Kennzeichnung sowie alle Filter einzeln und kombiniert.</w:t>
       </w:r>
     </w:p>
     <w:p>
@@ -2535,6 +2652,15 @@
       </w:pPr>
       <w:r>
         <w:t>Die Login-Bremse ist prozesslokal. Bei mehreren Replicas zählt jeder Pod eigene Fehlversuche; produktiv gehörte das in einen gemeinsamen Speicher.</w:t>
+      </w:r>
+    </w:p>
+    <w:p>
+      <w:pPr>
+        <w:pStyle w:val="ListBullet"/>
+        <w:spacing w:after="40"/>
+      </w:pPr>
+      <w:r>
+        <w:t>Nachträge prüfen die Reihenfolge nicht. Ein Admin kann bewusst ein zweites EIN einfügen, ohne dass der Zustandsautomat das verhindert – sonst liesse sich eine kaputte Folge gar nicht erst reparieren. Eine Plausibilitätsprüfung über den ganzen Tag gibt es nicht.</w:t>
       </w:r>
     </w:p>
     <w:sectPr>

</xml_diff>